<commit_message>
Add heading bookmarks and a live TOC to report Word exports
</commit_message>
<xml_diff>
--- a/src/briefloop/template_assets/research-report-zh.docx
+++ b/src/briefloop/template_assets/research-report-zh.docx
@@ -47,6 +47,32 @@
         </w:rPr>
         <w:t>{{period}} · {{report_date}}</w:t>
       </w:r>
+    </w:p>
+    <w:p>
+      <w:r>
+        <w:br w:type="page"/>
+      </w:r>
+    </w:p>
+    <w:p>
+      <w:pPr>
+        <w:spacing w:before="120" w:after="200"/>
+      </w:pPr>
+      <w:r>
+        <w:rPr>
+          <w:rFonts w:eastAsia="黑体"/>
+          <w:b/>
+          <w:color w:val="1E2320"/>
+          <w:sz w:val="30"/>
+        </w:rPr>
+        <w:t>目录</w:t>
+      </w:r>
+    </w:p>
+    <w:p>
+      <w:fldSimple w:instr=" TOC \o &quot;1-3&quot; \h \z \u ">
+        <w:r>
+          <w:t>目录将在打开文档时自动生成</w:t>
+        </w:r>
+      </w:fldSimple>
     </w:p>
     <w:p>
       <w:r>

</xml_diff>